<commit_message>
Update non-circumvention: active period + 3 months post-completion
- During active deal (until disbursement/cancellation): absolute no-bypass
- After deal ends: only 3 months restriction (reduced from 12)
- Added clarification: restriction only applies to Ruralift-introduced contacts
- Client free to independently approach any lender on their own
</commit_message>
<xml_diff>
--- a/Ruralift_Agreement_STRENGTHENED.docx
+++ b/Ruralift_Agreement_STRENGTHENED.docx
@@ -965,26 +965,82 @@
     </w:p>
     <w:p>
       <w:r>
-        <w:t xml:space="preserve">5.1 ग्राहक वचन देता है कि इस अनुबंध की अवधि के दौरान और इसकी समाप्ति/पूर्णता के बाद </w:t>
-      </w:r>
-      <w:r>
-        <w:rPr>
-          <w:b/>
-        </w:rPr>
-        <w:t xml:space="preserve">12 (बारह) महीनों तक</w:t>
-      </w:r>
-      <w:r>
-        <w:t xml:space="preserve">, ग्राहक Ruralift द्वारा परिचित कराए गए किसी भी ऋण संस्थान, बैंक अधिकारी, DSA, या किसी भी संपर्क से सीधे (Ruralift को दरकिनार करते हुए) ऋण सेवा प्राप्त करने का प्रयास नहीं करेगा।</w:t>
-      </w:r>
-    </w:p>
-    <w:p>
-      <w:r>
-        <w:t/>
-      </w:r>
-    </w:p>
-    <w:p>
-      <w:r>
-        <w:t xml:space="preserve">5.2 इस धारा के उल्लंघन की स्थिति में, ग्राहक धारा 4.2 में निर्धारित नुकसान भरपाई के अतिरिक्त, Ruralift को उचित क्षतिपूर्ति देने का उत्तरदायी होगा।</w:t>
+        <w:t xml:space="preserve">5.1 </w:t>
+      </w:r>
+      <w:r>
+        <w:rPr>
+          <w:b/>
+        </w:rPr>
+        <w:t xml:space="preserve">सक्रिय अवधि के दौरान (Active Period):</w:t>
+      </w:r>
+      <w:r>
+        <w:t xml:space="preserve"> जब तक इस अनुबंध के अंतर्गत ऋण आवेदन सक्रिय रूप से प्रसंस्करण में है — अर्थात् अनुबंध की तिथि से लेकर ऋण के सफल वितरण अथवा ऋण संस्थान द्वारा अंतिम अस्वीकृति/रद्दीकरण (जो भी पहले हो) तक — ग्राहक Ruralift द्वारा परिचित कराए गए किसी भी ऋण संस्थान, बैंक अधिकारी, DSA, या किसी भी संपर्क से सीधे (Ruralift को दरकिनार करते हुए) ऋण सेवा प्राप्त करने का प्रयास </w:t>
+      </w:r>
+      <w:r>
+        <w:rPr>
+          <w:b/>
+        </w:rPr>
+        <w:t xml:space="preserve">किसी भी परिस्थिति में नहीं</w:t>
+      </w:r>
+      <w:r>
+        <w:t xml:space="preserve"> करेगा।</w:t>
+      </w:r>
+    </w:p>
+    <w:p>
+      <w:r>
+        <w:t/>
+      </w:r>
+    </w:p>
+    <w:p>
+      <w:r>
+        <w:t xml:space="preserve">5.2 </w:t>
+      </w:r>
+      <w:r>
+        <w:rPr>
+          <w:b/>
+        </w:rPr>
+        <w:t xml:space="preserve">सक्रिय अवधि समाप्त होने के बाद (Post-Completion Period):</w:t>
+      </w:r>
+      <w:r>
+        <w:t xml:space="preserve"> ऋण के सफल वितरण अथवा अंतिम अस्वीकृति/रद्दीकरण के बाद </w:t>
+      </w:r>
+      <w:r>
+        <w:rPr>
+          <w:b/>
+        </w:rPr>
+        <w:t xml:space="preserve">3 (तीन) महीनों तक</w:t>
+      </w:r>
+      <w:r>
+        <w:t xml:space="preserve">, ग्राहक Ruralift द्वारा परिचित कराए गए उन्हीं संपर्कों (ऋण संस्थान, बैंक अधिकारी, DSA आदि) से सीधे (Ruralift को दरकिनार करते हुए) उसी प्रकार की ऋण सेवा प्राप्त करने का प्रयास नहीं करेगा। 3 महीने की अवधि पूर्ण होने के बाद ग्राहक स्वतंत्र है।</w:t>
+      </w:r>
+    </w:p>
+    <w:p>
+      <w:r>
+        <w:t/>
+      </w:r>
+    </w:p>
+    <w:p>
+      <w:r>
+        <w:t xml:space="preserve">5.3 </w:t>
+      </w:r>
+      <w:r>
+        <w:rPr>
+          <w:b/>
+        </w:rPr>
+        <w:t xml:space="preserve">स्पष्टीकरण:</w:t>
+      </w:r>
+      <w:r>
+        <w:t xml:space="preserve"> यह प्रतिबंध केवल Ruralift द्वारा परिचित कराए गए विशिष्ट संपर्कों पर लागू है। ग्राहक स्वतंत्र रूप से (Ruralift के संपर्कों के बिना) किसी भी ऋण संस्थान से संपर्क करने के लिए सदैव स्वतंत्र है।</w:t>
+      </w:r>
+    </w:p>
+    <w:p>
+      <w:r>
+        <w:t/>
+      </w:r>
+    </w:p>
+    <w:p>
+      <w:r>
+        <w:t xml:space="preserve">5.4 इस धारा के उल्लंघन की स्थिति में, ग्राहक धारा 4.2 में निर्धारित नुकसान भरपाई के अतिरिक्त, Ruralift को उचित क्षतिपूर्ति देने का उत्तरदायी होगा।</w:t>
       </w:r>
     </w:p>
     <w:p>

</xml_diff>

<commit_message>
Major update: DSA + independent consultancy dual structure protection
- Added MSME/Udyam registration reference for Ruralift legitimacy
- Added Section 1.4: Complete DSA separation clause with full disclosure
- Client explicitly acknowledges DSA commission exists AND separately
  agrees to pay additional consultancy fee (informed consent)
- Fee basis expanded: expert advisory, documentation, process management,
  time investment - services BEYOND standard DSA scope
- Section 11 strengthened: explicit fee separation from DSA commission,
  no set-off, client's informed consent after full disclosure
- Client declaration updated: explicit acknowledgment of dual structure
- Services list expanded to justify the additional fee (7 items)
- All language positions fee as 'independent consultancy' not 'DSA charge'
</commit_message>
<xml_diff>
--- a/Ruralift_Agreement_STRENGTHENED.docx
+++ b/Ruralift_Agreement_STRENGTHENED.docx
@@ -157,7 +157,7 @@
         <w:t xml:space="preserve">सेवा प्रदाता</w:t>
       </w:r>
       <w:r>
-        <w:t xml:space="preserve"> | Ruralift, स्वामी: Shaan Singh Bilhatiya (इसके बाद "Ruralift" या "परामर्शदाता" कहा जाएगा) |</w:t>
+        <w:t xml:space="preserve"> | Ruralift (MSME/Udyam पंजीकृत स्वामित्व संस्था), स्वामी: Shaan Singh Bilhatiya, Udyam नं.: __________________ (इसके बाद "Ruralift" या "परामर्शदाता" कहा जाएगा) |</w:t>
       </w:r>
     </w:p>
     <w:p>
@@ -251,7 +251,16 @@
     </w:p>
     <w:p>
       <w:r>
-        <w:t xml:space="preserve">1.1 Ruralift ग्राहक को निम्नलिखित ऋण सुविधा परामर्श सेवाएं </w:t>
+        <w:t xml:space="preserve">1.1 Ruralift एक MSME/Udyam पंजीकृत स्वतंत्र वित्तीय परामर्श एवं दस्तावेज़ सुविधा संस्था है जो ग्राहकों को निम्नलिखित </w:t>
+      </w:r>
+      <w:r>
+        <w:rPr>
+          <w:b/>
+        </w:rPr>
+        <w:t xml:space="preserve">परामर्श, दस्तावेज़ीकरण एवं सुविधा सेवाएं</w:t>
+      </w:r>
+      <w:r>
+        <w:t xml:space="preserve"> (Advisory, Documentation &amp; Facilitation Services) </w:t>
       </w:r>
       <w:r>
         <w:rPr>
@@ -260,67 +269,140 @@
         <w:t xml:space="preserve">सर्वोत्तम प्रयास (best efforts) के आधार पर</w:t>
       </w:r>
       <w:r>
-        <w:t xml:space="preserve"> प्रदान करने का वचन देता है:</w:t>
-      </w:r>
-    </w:p>
-    <w:p>
-      <w:r>
-        <w:t/>
-      </w:r>
-    </w:p>
-    <w:p>
-      <w:r>
-        <w:t xml:space="preserve">अ. ग्राहक की आय, क्रेडिट प्रोफाइल और ऋणदाता मानदंड के आधार पर ऋण पात्रता का प्रारंभिक आकलन।</w:t>
-      </w:r>
-    </w:p>
-    <w:p>
-      <w:r>
-        <w:t/>
-      </w:r>
-    </w:p>
-    <w:p>
-      <w:r>
-        <w:t xml:space="preserve">ब. उपयुक्त ऋण उत्पाद, ऋण राशि और उचित ऋण संस्थान के बारे में मार्गदर्शन।</w:t>
-      </w:r>
-    </w:p>
-    <w:p>
-      <w:r>
-        <w:t/>
-      </w:r>
-    </w:p>
-    <w:p>
-      <w:r>
-        <w:t xml:space="preserve">स. सभी आवश्यक दस्तावेजों की तैयारी, संकलन और समीक्षा में सहायता।</w:t>
-      </w:r>
-    </w:p>
-    <w:p>
-      <w:r>
-        <w:t/>
-      </w:r>
-    </w:p>
-    <w:p>
-      <w:r>
-        <w:t xml:space="preserve">द. ग्राहक की ओर से चिन्हित ऋण संस्थान को ऋण आवेदन जमा करना।</w:t>
-      </w:r>
-    </w:p>
-    <w:p>
-      <w:r>
-        <w:t/>
-      </w:r>
-    </w:p>
-    <w:p>
-      <w:r>
-        <w:t xml:space="preserve">इ. प्रसंस्करण, सत्यापन और स्वीकृति चरणों के दौरान ऋणदाता के साथ अनुवर्ती कार्रवाई।</w:t>
-      </w:r>
-    </w:p>
-    <w:p>
-      <w:r>
-        <w:t/>
-      </w:r>
-    </w:p>
-    <w:p>
-      <w:r>
-        <w:t xml:space="preserve">फ. ऋण राशि के वास्तविक वितरण तक समन्वय।</w:t>
+        <w:t xml:space="preserve"> प्रदान करती है:</w:t>
+      </w:r>
+    </w:p>
+    <w:p>
+      <w:r>
+        <w:t/>
+      </w:r>
+    </w:p>
+    <w:p>
+      <w:r>
+        <w:t xml:space="preserve">अ. ग्राहक की आय, रोज़गार स्थिति, क्रेडिट प्रोफाइल और ऋणदाता मानदंड के आधार पर </w:t>
+      </w:r>
+      <w:r>
+        <w:rPr>
+          <w:b/>
+        </w:rPr>
+        <w:t xml:space="preserve">ऋण पात्रता का विस्तृत आकलन एवं परामर्श।</w:t>
+      </w:r>
+      <w:r>
+        <w:t xml:space="preserve"/>
+      </w:r>
+    </w:p>
+    <w:p>
+      <w:r>
+        <w:t/>
+      </w:r>
+    </w:p>
+    <w:p>
+      <w:r>
+        <w:t xml:space="preserve">ब. उपयुक्त ऋण उत्पाद, ऋण राशि, अवधि और उचित ऋण संस्थान के बारे में </w:t>
+      </w:r>
+      <w:r>
+        <w:rPr>
+          <w:b/>
+        </w:rPr>
+        <w:t xml:space="preserve">तुलनात्मक विश्लेषण एवं मार्गदर्शन।</w:t>
+      </w:r>
+      <w:r>
+        <w:t xml:space="preserve"/>
+      </w:r>
+    </w:p>
+    <w:p>
+      <w:r>
+        <w:t/>
+      </w:r>
+    </w:p>
+    <w:p>
+      <w:r>
+        <w:t xml:space="preserve">स. सभी आवश्यक दस्तावेजों की </w:t>
+      </w:r>
+      <w:r>
+        <w:rPr>
+          <w:b/>
+        </w:rPr>
+        <w:t xml:space="preserve">तैयारी, संकलन, सत्यापन, फ़ॉर्मेटिंग और समीक्षा</w:t>
+      </w:r>
+      <w:r>
+        <w:t xml:space="preserve"> — जिसमें आय प्रमाण, निवास प्रमाण, बैंक स्टेटमेंट व्यवस्थापन, ITR सहायता, और अन्य ऋणदाता-विशिष्ट दस्तावेज़ शामिल हैं।</w:t>
+      </w:r>
+    </w:p>
+    <w:p>
+      <w:r>
+        <w:t/>
+      </w:r>
+    </w:p>
+    <w:p>
+      <w:r>
+        <w:t xml:space="preserve">द. ग्राहक की ओर से चिन्हित ऋण संस्थान को </w:t>
+      </w:r>
+      <w:r>
+        <w:rPr>
+          <w:b/>
+        </w:rPr>
+        <w:t xml:space="preserve">ऋण आवेदन की तैयारी एवं प्रस्तुतीकरण।</w:t>
+      </w:r>
+      <w:r>
+        <w:t xml:space="preserve"/>
+      </w:r>
+    </w:p>
+    <w:p>
+      <w:r>
+        <w:t/>
+      </w:r>
+    </w:p>
+    <w:p>
+      <w:r>
+        <w:t xml:space="preserve">इ. प्रसंस्करण, सत्यापन और स्वीकृति चरणों के दौरान ऋणदाता के साथ </w:t>
+      </w:r>
+      <w:r>
+        <w:rPr>
+          <w:b/>
+        </w:rPr>
+        <w:t xml:space="preserve">निरंतर अनुवर्ती कार्रवाई एवं समन्वय।</w:t>
+      </w:r>
+      <w:r>
+        <w:t xml:space="preserve"/>
+      </w:r>
+    </w:p>
+    <w:p>
+      <w:r>
+        <w:t/>
+      </w:r>
+    </w:p>
+    <w:p>
+      <w:r>
+        <w:t xml:space="preserve">फ. ऋण राशि के वास्तविक वितरण तक </w:t>
+      </w:r>
+      <w:r>
+        <w:rPr>
+          <w:b/>
+        </w:rPr>
+        <w:t xml:space="preserve">सम्पूर्ण प्रक्रिया प्रबंधन एवं ग्राहक सहायता।</w:t>
+      </w:r>
+      <w:r>
+        <w:t xml:space="preserve"/>
+      </w:r>
+    </w:p>
+    <w:p>
+      <w:r>
+        <w:t/>
+      </w:r>
+    </w:p>
+    <w:p>
+      <w:r>
+        <w:t xml:space="preserve">ग. </w:t>
+      </w:r>
+      <w:r>
+        <w:rPr>
+          <w:b/>
+        </w:rPr>
+        <w:t xml:space="preserve">ग्राहक शिक्षा:</w:t>
+      </w:r>
+      <w:r>
+        <w:t xml:space="preserve"> ऋण की शर्तें, EMI गणना, पूर्व-भुगतान विकल्प, और ऋण संस्थान की नीतियों के बारे में ग्राहक को समझाना।</w:t>
       </w:r>
     </w:p>
     <w:p>
@@ -336,10 +418,28 @@
         <w:rPr>
           <w:b/>
         </w:rPr>
-        <w:t xml:space="preserve">सेवा की प्रकृति — सर्वोत्तम प्रयास:</w:t>
-      </w:r>
-      <w:r>
-        <w:t xml:space="preserve"> Ruralift की सेवाएं पूर्णतः "सर्वोत्तम प्रयास" (best efforts) आधारित हैं। Ruralift ऋण स्वीकृति, ऋण राशि, ब्याज दर, या वितरण की समय-सीमा के संबंध में कोई गारंटी, वारंटी, आश्वासन या वचन नहीं देता — चाहे मौखिक हो या लिखित। ग्राहक स्वीकार करता है कि ऋण स्वीकृति या अस्वीकृति का निर्णय पूर्णतः ऋण संस्थान के अधिकार क्षेत्र में है और Ruralift का इस पर कोई नियंत्रण या प्रभाव नहीं है।</w:t>
+        <w:t xml:space="preserve">सेवा की प्रकृति — सर्वोत्तम प्रयास एवं स्वतंत्र परामर्श:</w:t>
+      </w:r>
+      <w:r>
+        <w:t xml:space="preserve"> Ruralift की उपरोक्त सेवाएं पूर्णतः "सर्वोत्तम प्रयास" (best efforts) आधारित </w:t>
+      </w:r>
+      <w:r>
+        <w:rPr>
+          <w:b/>
+        </w:rPr>
+        <w:t xml:space="preserve">स्वतंत्र परामर्श एवं सुविधा सेवाएं</w:t>
+      </w:r>
+      <w:r>
+        <w:t xml:space="preserve"> हैं। यह शुल्क Ruralift द्वारा प्रदान की गई </w:t>
+      </w:r>
+      <w:r>
+        <w:rPr>
+          <w:b/>
+        </w:rPr>
+        <w:t xml:space="preserve">विशेषज्ञ परामर्श, समय, श्रम, दस्तावेज़ीकरण कार्य, प्रक्रिया प्रबंधन और व्यावसायिक विशेषज्ञता</w:t>
+      </w:r>
+      <w:r>
+        <w:t xml:space="preserve"> के प्रतिफल (consideration) में है। Ruralift ऋण स्वीकृति, ऋण राशि, ब्याज दर, या वितरण की समय-सीमा के संबंध में कोई गारंटी, वारंटी, आश्वासन या वचन नहीं देता — चाहे मौखिक हो या लिखित। ग्राहक स्वीकार करता है कि ऋण स्वीकृति या अस्वीकृति का निर्णय पूर्णतः ऋण संस्थान के अधिकार क्षेत्र में है और Ruralift का इस पर कोई नियंत्रण या प्रभाव नहीं है।</w:t>
       </w:r>
     </w:p>
     <w:p>
@@ -368,7 +468,111 @@
     </w:p>
     <w:p>
       <w:r>
-        <w:t xml:space="preserve">1.4 उपरोक्त सेवाएं Ruralift द्वारा एक स्वतंत्र परामर्श संस्था के रूप में प्रदान की जाती हैं और ऋण संस्थान की अपनी प्रक्रियाओं, शुल्कों या प्रभारों से पूर्णतः अलग एवं स्वतंत्र हैं।</w:t>
+        <w:t xml:space="preserve">1.4 </w:t>
+      </w:r>
+      <w:r>
+        <w:rPr>
+          <w:b/>
+        </w:rPr>
+        <w:t xml:space="preserve">DSA संबंध से पूर्ण पृथक्करण:</w:t>
+      </w:r>
+      <w:r>
+        <w:t xml:space="preserve"> ग्राहक स्वीकार करता है और समझता है कि:</w:t>
+      </w:r>
+    </w:p>
+    <w:p>
+      <w:r>
+        <w:t/>
+      </w:r>
+    </w:p>
+    <w:p>
+      <w:r>
+        <w:t xml:space="preserve">अ. Ruralift या इसके स्वामी का विभिन्न ऋण संस्थानों के साथ DSA (Direct Selling Agent) या चैनल पार्टनर के रूप में स्वतंत्र व्यापारिक संबंध हो सकता है जिसके अंतर्गत ऋण संस्थान Ruralift को प्रत्यक्ष रूप से कमीशन/पारिश्रमिक देता है।</w:t>
+      </w:r>
+    </w:p>
+    <w:p>
+      <w:r>
+        <w:t/>
+      </w:r>
+    </w:p>
+    <w:p>
+      <w:r>
+        <w:t xml:space="preserve">ब. </w:t>
+      </w:r>
+      <w:r>
+        <w:rPr>
+          <w:b/>
+        </w:rPr>
+        <w:t xml:space="preserve">यह अनुबंध उक्त DSA संबंध से पूर्णतः अलग, स्वतंत्र और असंबद्ध है।</w:t>
+      </w:r>
+      <w:r>
+        <w:t xml:space="preserve"> इस अनुबंध के अंतर्गत ग्राहक द्वारा देय परामर्श शुल्क Ruralift द्वारा प्रदान की गई </w:t>
+      </w:r>
+      <w:r>
+        <w:rPr>
+          <w:b/>
+        </w:rPr>
+        <w:t xml:space="preserve">अतिरिक्त परामर्श, दस्तावेज़ीकरण, सुविधा एवं प्रक्रिया प्रबंधन सेवाओं</w:t>
+      </w:r>
+      <w:r>
+        <w:t xml:space="preserve"> के लिए है — जो DSA के मानक कार्यक्षेत्र से परे एवं अतिरिक्त हैं।</w:t>
+      </w:r>
+    </w:p>
+    <w:p>
+      <w:r>
+        <w:t/>
+      </w:r>
+    </w:p>
+    <w:p>
+      <w:r>
+        <w:t xml:space="preserve">स. ग्राहक द्वारा देय शुल्क किसी भी ऋण संस्थान द्वारा Ruralift को दिए जाने वाले कमीशन से </w:t>
+      </w:r>
+      <w:r>
+        <w:rPr>
+          <w:b/>
+        </w:rPr>
+        <w:t xml:space="preserve">पूर्णतः अलग एवं अतिरिक्त</w:t>
+      </w:r>
+      <w:r>
+        <w:t xml:space="preserve"> है और दोनों के बीच कोई संबंध, समायोजन (set-off) या दोहराव नहीं है।</w:t>
+      </w:r>
+    </w:p>
+    <w:p>
+      <w:r>
+        <w:t/>
+      </w:r>
+    </w:p>
+    <w:p>
+      <w:r>
+        <w:t xml:space="preserve">द. ग्राहक ने यह जानकारी प्राप्त करने के बाद, </w:t>
+      </w:r>
+      <w:r>
+        <w:rPr>
+          <w:b/>
+        </w:rPr>
+        <w:t xml:space="preserve">पूर्ण जानकारी एवं सूचित सहमति</w:t>
+      </w:r>
+      <w:r>
+        <w:t xml:space="preserve"> से इस अनुबंध पर हस्ताक्षर किए हैं।</w:t>
+      </w:r>
+    </w:p>
+    <w:p>
+      <w:r>
+        <w:t/>
+      </w:r>
+    </w:p>
+    <w:p>
+      <w:r>
+        <w:t xml:space="preserve">1.5 उपरोक्त सेवाएं Ruralift द्वारा एक </w:t>
+      </w:r>
+      <w:r>
+        <w:rPr>
+          <w:b/>
+        </w:rPr>
+        <w:t xml:space="preserve">MSME पंजीकृत स्वतंत्र परामर्श संस्था</w:t>
+      </w:r>
+      <w:r>
+        <w:t xml:space="preserve"> के रूप में प्रदान की जाती हैं और ऋण संस्थान की अपनी प्रक्रियाओं, शुल्कों या प्रभारों से पूर्णतः अलग एवं स्वतंत्र हैं।</w:t>
       </w:r>
     </w:p>
     <w:p>
@@ -473,7 +677,43 @@
     </w:p>
     <w:p>
       <w:r>
-        <w:t xml:space="preserve">2.2 यह शुल्क केवल Ruralift द्वारा प्रदान की गई परामर्श और सुविधा सेवाओं के लिए है और ऋण संस्थान द्वारा लगाए गए किसी भी शुल्क से पूर्णतः अलग है।</w:t>
+        <w:t xml:space="preserve">2.2 </w:t>
+      </w:r>
+      <w:r>
+        <w:rPr>
+          <w:b/>
+        </w:rPr>
+        <w:t xml:space="preserve">शुल्क का आधार:</w:t>
+      </w:r>
+      <w:r>
+        <w:t xml:space="preserve"> यह शुल्क Ruralift द्वारा प्रदान की गई </w:t>
+      </w:r>
+      <w:r>
+        <w:rPr>
+          <w:b/>
+        </w:rPr>
+        <w:t xml:space="preserve">स्वतंत्र परामर्श, दस्तावेज़ीकरण, प्रक्रिया प्रबंधन, समय निवेश, विशेषज्ञ मार्गदर्शन और सुविधा सेवाओं</w:t>
+      </w:r>
+      <w:r>
+        <w:t xml:space="preserve"> के प्रतिफल में है। यह शुल्क ऋण संस्थान द्वारा Ruralift को (DSA/चैनल पार्टनर के रूप में) दिए जाने वाले किसी भी कमीशन से </w:t>
+      </w:r>
+      <w:r>
+        <w:rPr>
+          <w:b/>
+        </w:rPr>
+        <w:t xml:space="preserve">पूर्णतः अलग, अतिरिक्त और असंबद्ध</w:t>
+      </w:r>
+      <w:r>
+        <w:t xml:space="preserve"> है। ग्राहक स्वीकार करता है कि Ruralift की सेवाएं DSA के मानक कार्यक्षेत्र (जैसे केवल आवेदन फ़ॉर्म भरना) से </w:t>
+      </w:r>
+      <w:r>
+        <w:rPr>
+          <w:b/>
+        </w:rPr>
+        <w:t xml:space="preserve">कहीं अधिक विस्तृत एवं मूल्यवान</w:t>
+      </w:r>
+      <w:r>
+        <w:t xml:space="preserve"> हैं और इसीलिए अतिरिक्त परामर्श शुल्क उचित एवं न्यायसंगत है। यह शुल्क ऋण संस्थान द्वारा ग्राहक पर लगाए गए किसी भी शुल्क, प्रसंस्करण शुल्क, या EMI से भी पूर्णतः अलग है।</w:t>
       </w:r>
     </w:p>
     <w:p>
@@ -1512,7 +1752,16 @@
     </w:p>
     <w:p>
       <w:r>
-        <w:t xml:space="preserve">11.1 Ruralift एक स्वतंत्र ऋण सुविधा परामर्श संस्था है और कोई बैंक, NBFC, ऋण संस्थान या पंजीकृत वित्तीय संस्था नहीं है। Ruralift पैसा उधार नहीं देता, ऋण स्वीकृति की गारंटी नहीं देता और ऋण संस्थान के किसी भी निर्णय को प्रभावित करने का दावा नहीं करता।</w:t>
+        <w:t xml:space="preserve">11.1 Ruralift एक </w:t>
+      </w:r>
+      <w:r>
+        <w:rPr>
+          <w:b/>
+        </w:rPr>
+        <w:t xml:space="preserve">MSME/Udyam पंजीकृत स्वतंत्र वित्तीय परामर्श एवं दस्तावेज़ सुविधा संस्था</w:t>
+      </w:r>
+      <w:r>
+        <w:t xml:space="preserve"> है और कोई बैंक, NBFC, ऋण संस्थान या पंजीकृत वित्तीय संस्था नहीं है। Ruralift पैसा उधार नहीं देता, ऋण स्वीकृति की गारंटी नहीं देता और ऋण संस्थान के किसी भी निर्णय को प्रभावित करने का दावा नहीं करता।</w:t>
       </w:r>
     </w:p>
     <w:p>
@@ -1532,7 +1781,40 @@
     </w:p>
     <w:p>
       <w:r>
-        <w:t xml:space="preserve">11.3 Ruralift को देय परामर्श शुल्क ऋण संस्थान द्वारा ग्राहक पर लगाए गए किसी भी शुल्क, EMI, प्रसंस्करण शुल्क या किसी भी राशि से पूर्णतः अलग एवं स्वतंत्र है।</w:t>
+        <w:t xml:space="preserve">11.3 </w:t>
+      </w:r>
+      <w:r>
+        <w:rPr>
+          <w:b/>
+        </w:rPr>
+        <w:t xml:space="preserve">शुल्क पृथक्करण:</w:t>
+      </w:r>
+      <w:r>
+        <w:t xml:space="preserve"> Ruralift को इस अनुबंध के अंतर्गत देय परामर्श शुल्क निम्नलिखित सभी से </w:t>
+      </w:r>
+      <w:r>
+        <w:rPr>
+          <w:b/>
+        </w:rPr>
+        <w:t xml:space="preserve">पूर्णतः अलग, स्वतंत्र एवं असंबद्ध</w:t>
+      </w:r>
+      <w:r>
+        <w:t xml:space="preserve"> है:</w:t>
+      </w:r>
+    </w:p>
+    <w:p>
+      <w:r>
+        <w:t xml:space="preserve">- ऋण संस्थान द्वारा ग्राहक पर लगाया गया कोई भी शुल्क (प्रसंस्करण शुल्क, EMI, बीमा आदि)</w:t>
+      </w:r>
+    </w:p>
+    <w:p>
+      <w:r>
+        <w:t xml:space="preserve">- ऋण संस्थान द्वारा Ruralift/DSA को दिया जाने वाला कोई भी कमीशन/पारिश्रमिक</w:t>
+      </w:r>
+    </w:p>
+    <w:p>
+      <w:r>
+        <w:t xml:space="preserve">- ग्राहक का परामर्श शुल्क Ruralift के DSA कमीशन से समायोजित (set-off) नहीं किया जाएगा</w:t>
       </w:r>
     </w:p>
     <w:p>
@@ -1543,6 +1825,81 @@
     <w:p>
       <w:r>
         <w:t xml:space="preserve">11.4 </w:t>
+      </w:r>
+      <w:r>
+        <w:rPr>
+          <w:b/>
+        </w:rPr>
+        <w:t xml:space="preserve">ग्राहक की सूचित सहमति:</w:t>
+      </w:r>
+      <w:r>
+        <w:t xml:space="preserve"> ग्राहक स्वीकार करता है कि उसे निम्नलिखित तथ्यों की </w:t>
+      </w:r>
+      <w:r>
+        <w:rPr>
+          <w:b/>
+        </w:rPr>
+        <w:t xml:space="preserve">पूर्ण जानकारी</w:t>
+      </w:r>
+      <w:r>
+        <w:t xml:space="preserve"> दी गई है और उसने </w:t>
+      </w:r>
+      <w:r>
+        <w:rPr>
+          <w:b/>
+        </w:rPr>
+        <w:t xml:space="preserve">सूचित सहमति</w:t>
+      </w:r>
+      <w:r>
+        <w:t xml:space="preserve"> से यह अनुबंध किया है:</w:t>
+      </w:r>
+    </w:p>
+    <w:p>
+      <w:r>
+        <w:t xml:space="preserve">- Ruralift/इसके स्वामी का ऋण संस्थानों के साथ DSA/चैनल पार्टनर संबंध हो सकता है</w:t>
+      </w:r>
+    </w:p>
+    <w:p>
+      <w:r>
+        <w:t xml:space="preserve">- Ruralift को ऋण संस्थान से पृथक रूप से कमीशन प्राप्त हो सकता है</w:t>
+      </w:r>
+    </w:p>
+    <w:p>
+      <w:r>
+        <w:t xml:space="preserve">- इस अनुबंध का परामर्श शुल्क उक्त कमीशन से </w:t>
+      </w:r>
+      <w:r>
+        <w:rPr>
+          <w:b/>
+        </w:rPr>
+        <w:t xml:space="preserve">अतिरिक्त</w:t>
+      </w:r>
+      <w:r>
+        <w:t xml:space="preserve"> है</w:t>
+      </w:r>
+    </w:p>
+    <w:p>
+      <w:r>
+        <w:t xml:space="preserve">- ग्राहक ने यह सब जानते हुए, </w:t>
+      </w:r>
+      <w:r>
+        <w:rPr>
+          <w:b/>
+        </w:rPr>
+        <w:t xml:space="preserve">बिना किसी दबाव, स्वेच्छा से</w:t>
+      </w:r>
+      <w:r>
+        <w:t xml:space="preserve"> इस शुल्क पर सहमति दी है</w:t>
+      </w:r>
+    </w:p>
+    <w:p>
+      <w:r>
+        <w:t/>
+      </w:r>
+    </w:p>
+    <w:p>
+      <w:r>
+        <w:t xml:space="preserve">11.5 </w:t>
       </w:r>
       <w:r>
         <w:rPr>
@@ -2200,7 +2557,26 @@
     </w:p>
     <w:p>
       <w:r>
-        <w:t xml:space="preserve">ञ. </w:t>
+        <w:t xml:space="preserve">ञ. मैं समझता/समझती हूँ कि Ruralift/इसके स्वामी का ऋण संस्थानों के साथ DSA/चैनल पार्टनर संबंध हो सकता है और Ruralift को ऋण संस्थान से कमीशन प्राप्त हो सकता है। </w:t>
+      </w:r>
+      <w:r>
+        <w:rPr>
+          <w:b/>
+        </w:rPr>
+        <w:t xml:space="preserve">मैं यह जानते हुए भी स्वेच्छा से इस अनुबंध के अंतर्गत अतिरिक्त परामर्श शुल्क देने पर सहमत हूँ</w:t>
+      </w:r>
+      <w:r>
+        <w:t xml:space="preserve"> क्योंकि Ruralift की परामर्श, दस्तावेज़ीकरण एवं सुविधा सेवाएं DSA के सामान्य कार्यक्षेत्र से अतिरिक्त एवं मूल्यवान हैं।</w:t>
+      </w:r>
+    </w:p>
+    <w:p>
+      <w:r>
+        <w:t/>
+      </w:r>
+    </w:p>
+    <w:p>
+      <w:r>
+        <w:t xml:space="preserve">ट. </w:t>
       </w:r>
       <w:r>
         <w:rPr>

</xml_diff>